<commit_message>
Benchmarked and Collected datat - (Developed code for CollectionBenchmark.java wwith assistance and understood the output for timeA.csv)
</commit_message>
<xml_diff>
--- a/Collections_Complexity_Lab_Report.docx
+++ b/Collections_Complexity_Lab_Report.docx
@@ -76,12 +76,6 @@
         <w:gridCol w:w="6160"/>
       </w:tblGrid>
       <w:tr>
-        <w:tblPrEx>
-          <w:tblCellMar>
-            <w:top w:w="0" w:type="dxa"/>
-            <w:bottom w:w="0" w:type="dxa"/>
-          </w:tblCellMar>
-        </w:tblPrEx>
         <w:tc>
           <w:tcPr>
             <w:tcW w:w="3200" w:type="dxa"/>
@@ -133,16 +127,13 @@
             <w:r>
               <w:t xml:space="preserve"> </w:t>
             </w:r>
+            <w:r>
+              <w:t>Zachary Scott</w:t>
+            </w:r>
           </w:p>
         </w:tc>
       </w:tr>
       <w:tr>
-        <w:tblPrEx>
-          <w:tblCellMar>
-            <w:top w:w="0" w:type="dxa"/>
-            <w:bottom w:w="0" w:type="dxa"/>
-          </w:tblCellMar>
-        </w:tblPrEx>
         <w:tc>
           <w:tcPr>
             <w:tcW w:w="3200" w:type="dxa"/>
@@ -194,16 +185,13 @@
             <w:r>
               <w:t xml:space="preserve"> </w:t>
             </w:r>
+            <w:r>
+              <w:t>20189175</w:t>
+            </w:r>
           </w:p>
         </w:tc>
       </w:tr>
       <w:tr>
-        <w:tblPrEx>
-          <w:tblCellMar>
-            <w:top w:w="0" w:type="dxa"/>
-            <w:bottom w:w="0" w:type="dxa"/>
-          </w:tblCellMar>
-        </w:tblPrEx>
         <w:tc>
           <w:tcPr>
             <w:tcW w:w="3200" w:type="dxa"/>
@@ -255,16 +243,13 @@
             <w:r>
               <w:t xml:space="preserve"> </w:t>
             </w:r>
+            <w:r>
+              <w:t>2026/06/22</w:t>
+            </w:r>
           </w:p>
         </w:tc>
       </w:tr>
       <w:tr>
-        <w:tblPrEx>
-          <w:tblCellMar>
-            <w:top w:w="0" w:type="dxa"/>
-            <w:bottom w:w="0" w:type="dxa"/>
-          </w:tblCellMar>
-        </w:tblPrEx>
         <w:tc>
           <w:tcPr>
             <w:tcW w:w="3200" w:type="dxa"/>
@@ -316,16 +301,13 @@
             <w:r>
               <w:t xml:space="preserve"> </w:t>
             </w:r>
+            <w:r>
+              <w:t>https://github.com/ZachScott123/lab2-java</w:t>
+            </w:r>
           </w:p>
         </w:tc>
       </w:tr>
       <w:tr>
-        <w:tblPrEx>
-          <w:tblCellMar>
-            <w:top w:w="0" w:type="dxa"/>
-            <w:bottom w:w="0" w:type="dxa"/>
-          </w:tblCellMar>
-        </w:tblPrEx>
         <w:tc>
           <w:tcPr>
             <w:tcW w:w="3200" w:type="dxa"/>
@@ -377,16 +359,55 @@
             <w:r>
               <w:t xml:space="preserve"> </w:t>
             </w:r>
+            <w:r>
+              <w:t>CPU</w:t>
+            </w:r>
+          </w:p>
+          <w:p>
+            <w:r>
+              <w:tab/>
+              <w:t xml:space="preserve">13th Gen Intel(R) </w:t>
+            </w:r>
+            <w:r>
+              <w:t>Core (</w:t>
+            </w:r>
+            <w:r>
+              <w:t>TM) i7-13620H</w:t>
+            </w:r>
+          </w:p>
+          <w:p>
+            <w:r>
+              <w:tab/>
+              <w:t>Base speed:</w:t>
+            </w:r>
+            <w:r>
+              <w:tab/>
+              <w:t>2.40 GHz</w:t>
+            </w:r>
+          </w:p>
+          <w:p>
+            <w:r>
+              <w:tab/>
+              <w:t>Cores:</w:t>
+            </w:r>
+            <w:r>
+              <w:tab/>
+              <w:t>10</w:t>
+            </w:r>
+          </w:p>
+          <w:p>
+            <w:r>
+              <w:tab/>
+              <w:t>Logical processors:</w:t>
+            </w:r>
+            <w:r>
+              <w:tab/>
+              <w:t>16</w:t>
+            </w:r>
           </w:p>
         </w:tc>
       </w:tr>
       <w:tr>
-        <w:tblPrEx>
-          <w:tblCellMar>
-            <w:top w:w="0" w:type="dxa"/>
-            <w:bottom w:w="0" w:type="dxa"/>
-          </w:tblCellMar>
-        </w:tblPrEx>
         <w:tc>
           <w:tcPr>
             <w:tcW w:w="3200" w:type="dxa"/>
@@ -438,16 +459,29 @@
             <w:r>
               <w:t xml:space="preserve"> </w:t>
             </w:r>
+            <w:r>
+              <w:t>RAM</w:t>
+            </w:r>
+          </w:p>
+          <w:p>
+            <w:r>
+              <w:tab/>
+              <w:t>16.0 GB</w:t>
+            </w:r>
+          </w:p>
+          <w:p>
+            <w:r>
+              <w:tab/>
+              <w:t>Speed:</w:t>
+            </w:r>
+            <w:r>
+              <w:tab/>
+              <w:t>5200 MT/s</w:t>
+            </w:r>
           </w:p>
         </w:tc>
       </w:tr>
       <w:tr>
-        <w:tblPrEx>
-          <w:tblCellMar>
-            <w:top w:w="0" w:type="dxa"/>
-            <w:bottom w:w="0" w:type="dxa"/>
-          </w:tblCellMar>
-        </w:tblPrEx>
         <w:tc>
           <w:tcPr>
             <w:tcW w:w="3200" w:type="dxa"/>
@@ -499,6 +533,9 @@
             <w:r>
               <w:t xml:space="preserve"> </w:t>
             </w:r>
+            <w:r>
+              <w:t>Windows 11</w:t>
+            </w:r>
           </w:p>
         </w:tc>
       </w:tr>
@@ -513,6 +550,7 @@
         <w:pStyle w:val="Heading1"/>
       </w:pPr>
       <w:r>
+        <w:lastRenderedPageBreak/>
         <w:t>1. Predictions (fill in BEFORE you run anything)</w:t>
       </w:r>
     </w:p>
@@ -554,12 +592,6 @@
         <w:gridCol w:w="4260"/>
       </w:tblGrid>
       <w:tr>
-        <w:tblPrEx>
-          <w:tblCellMar>
-            <w:top w:w="0" w:type="dxa"/>
-            <w:bottom w:w="0" w:type="dxa"/>
-          </w:tblCellMar>
-        </w:tblPrEx>
         <w:trPr>
           <w:tblHeader/>
         </w:trPr>
@@ -658,12 +690,6 @@
         </w:tc>
       </w:tr>
       <w:tr>
-        <w:tblPrEx>
-          <w:tblCellMar>
-            <w:top w:w="0" w:type="dxa"/>
-            <w:bottom w:w="0" w:type="dxa"/>
-          </w:tblCellMar>
-        </w:tblPrEx>
         <w:tc>
           <w:tcPr>
             <w:tcW w:w="2700" w:type="dxa"/>
@@ -682,37 +708,255 @@
             <w:vAlign w:val="center"/>
           </w:tcPr>
           <w:p>
-            <w:proofErr w:type="spellStart"/>
             <w:r>
               <w:rPr>
                 <w:sz w:val="19"/>
                 <w:szCs w:val="19"/>
               </w:rPr>
-              <w:t>ArrayList.get</w:t>
-            </w:r>
-            <w:proofErr w:type="spellEnd"/>
+              <w:t>ArrayList.get(i)</w:t>
+            </w:r>
+          </w:p>
+        </w:tc>
+        <w:tc>
+          <w:tcPr>
+            <w:tcW w:w="2400" w:type="dxa"/>
+            <w:tcBorders>
+              <w:top w:val="single" w:sz="1" w:space="0" w:color="BBBBBB"/>
+              <w:left w:val="single" w:sz="1" w:space="0" w:color="BBBBBB"/>
+              <w:bottom w:val="single" w:sz="1" w:space="0" w:color="BBBBBB"/>
+              <w:right w:val="single" w:sz="1" w:space="0" w:color="BBBBBB"/>
+            </w:tcBorders>
+            <w:tcMar>
+              <w:top w:w="80" w:type="dxa"/>
+              <w:left w:w="110" w:type="dxa"/>
+              <w:bottom w:w="80" w:type="dxa"/>
+              <w:right w:w="110" w:type="dxa"/>
+            </w:tcMar>
+            <w:vAlign w:val="center"/>
+          </w:tcPr>
+          <w:p>
+            <w:r>
+              <w:t xml:space="preserve"> </w:t>
+            </w:r>
+            <w:r>
+              <w:t>O(1)</w:t>
+            </w:r>
+          </w:p>
+        </w:tc>
+        <w:tc>
+          <w:tcPr>
+            <w:tcW w:w="4260" w:type="dxa"/>
+            <w:tcBorders>
+              <w:top w:val="single" w:sz="1" w:space="0" w:color="BBBBBB"/>
+              <w:left w:val="single" w:sz="1" w:space="0" w:color="BBBBBB"/>
+              <w:bottom w:val="single" w:sz="1" w:space="0" w:color="BBBBBB"/>
+              <w:right w:val="single" w:sz="1" w:space="0" w:color="BBBBBB"/>
+            </w:tcBorders>
+            <w:tcMar>
+              <w:top w:w="80" w:type="dxa"/>
+              <w:left w:w="110" w:type="dxa"/>
+              <w:bottom w:w="80" w:type="dxa"/>
+              <w:right w:w="110" w:type="dxa"/>
+            </w:tcMar>
+            <w:vAlign w:val="center"/>
+          </w:tcPr>
+          <w:p>
+            <w:r>
+              <w:t xml:space="preserve"> </w:t>
+            </w:r>
+            <w:r>
+              <w:t>Flat line</w:t>
+            </w:r>
+          </w:p>
+        </w:tc>
+      </w:tr>
+      <w:tr>
+        <w:tc>
+          <w:tcPr>
+            <w:tcW w:w="2700" w:type="dxa"/>
+            <w:tcBorders>
+              <w:top w:val="single" w:sz="1" w:space="0" w:color="BBBBBB"/>
+              <w:left w:val="single" w:sz="1" w:space="0" w:color="BBBBBB"/>
+              <w:bottom w:val="single" w:sz="1" w:space="0" w:color="BBBBBB"/>
+              <w:right w:val="single" w:sz="1" w:space="0" w:color="BBBBBB"/>
+            </w:tcBorders>
+            <w:tcMar>
+              <w:top w:w="80" w:type="dxa"/>
+              <w:left w:w="110" w:type="dxa"/>
+              <w:bottom w:w="80" w:type="dxa"/>
+              <w:right w:w="110" w:type="dxa"/>
+            </w:tcMar>
+            <w:vAlign w:val="center"/>
+          </w:tcPr>
+          <w:p>
             <w:r>
               <w:rPr>
                 <w:sz w:val="19"/>
                 <w:szCs w:val="19"/>
               </w:rPr>
-              <w:t>(</w:t>
-            </w:r>
-            <w:proofErr w:type="spellStart"/>
+              <w:t>ArrayList.add (at end)</w:t>
+            </w:r>
+          </w:p>
+        </w:tc>
+        <w:tc>
+          <w:tcPr>
+            <w:tcW w:w="2400" w:type="dxa"/>
+            <w:tcBorders>
+              <w:top w:val="single" w:sz="1" w:space="0" w:color="BBBBBB"/>
+              <w:left w:val="single" w:sz="1" w:space="0" w:color="BBBBBB"/>
+              <w:bottom w:val="single" w:sz="1" w:space="0" w:color="BBBBBB"/>
+              <w:right w:val="single" w:sz="1" w:space="0" w:color="BBBBBB"/>
+            </w:tcBorders>
+            <w:tcMar>
+              <w:top w:w="80" w:type="dxa"/>
+              <w:left w:w="110" w:type="dxa"/>
+              <w:bottom w:w="80" w:type="dxa"/>
+              <w:right w:w="110" w:type="dxa"/>
+            </w:tcMar>
+            <w:vAlign w:val="center"/>
+          </w:tcPr>
+          <w:p>
+            <w:r>
+              <w:t xml:space="preserve"> </w:t>
+            </w:r>
+            <w:r>
+              <w:t>O(1) amortized</w:t>
+            </w:r>
+          </w:p>
+        </w:tc>
+        <w:tc>
+          <w:tcPr>
+            <w:tcW w:w="4260" w:type="dxa"/>
+            <w:tcBorders>
+              <w:top w:val="single" w:sz="1" w:space="0" w:color="BBBBBB"/>
+              <w:left w:val="single" w:sz="1" w:space="0" w:color="BBBBBB"/>
+              <w:bottom w:val="single" w:sz="1" w:space="0" w:color="BBBBBB"/>
+              <w:right w:val="single" w:sz="1" w:space="0" w:color="BBBBBB"/>
+            </w:tcBorders>
+            <w:tcMar>
+              <w:top w:w="80" w:type="dxa"/>
+              <w:left w:w="110" w:type="dxa"/>
+              <w:bottom w:w="80" w:type="dxa"/>
+              <w:right w:w="110" w:type="dxa"/>
+            </w:tcMar>
+            <w:vAlign w:val="center"/>
+          </w:tcPr>
+          <w:p>
+            <w:r>
+              <w:t xml:space="preserve"> </w:t>
+            </w:r>
+            <w:r>
+              <w:t>Flat with occasional spikes</w:t>
+            </w:r>
+          </w:p>
+        </w:tc>
+      </w:tr>
+      <w:tr>
+        <w:tc>
+          <w:tcPr>
+            <w:tcW w:w="2700" w:type="dxa"/>
+            <w:tcBorders>
+              <w:top w:val="single" w:sz="1" w:space="0" w:color="BBBBBB"/>
+              <w:left w:val="single" w:sz="1" w:space="0" w:color="BBBBBB"/>
+              <w:bottom w:val="single" w:sz="1" w:space="0" w:color="BBBBBB"/>
+              <w:right w:val="single" w:sz="1" w:space="0" w:color="BBBBBB"/>
+            </w:tcBorders>
+            <w:tcMar>
+              <w:top w:w="80" w:type="dxa"/>
+              <w:left w:w="110" w:type="dxa"/>
+              <w:bottom w:w="80" w:type="dxa"/>
+              <w:right w:w="110" w:type="dxa"/>
+            </w:tcMar>
+            <w:vAlign w:val="center"/>
+          </w:tcPr>
+          <w:p>
             <w:r>
               <w:rPr>
                 <w:sz w:val="19"/>
                 <w:szCs w:val="19"/>
               </w:rPr>
-              <w:t>i</w:t>
-            </w:r>
-            <w:proofErr w:type="spellEnd"/>
+              <w:t>LinkedList.get(i)</w:t>
+            </w:r>
+          </w:p>
+        </w:tc>
+        <w:tc>
+          <w:tcPr>
+            <w:tcW w:w="2400" w:type="dxa"/>
+            <w:tcBorders>
+              <w:top w:val="single" w:sz="1" w:space="0" w:color="BBBBBB"/>
+              <w:left w:val="single" w:sz="1" w:space="0" w:color="BBBBBB"/>
+              <w:bottom w:val="single" w:sz="1" w:space="0" w:color="BBBBBB"/>
+              <w:right w:val="single" w:sz="1" w:space="0" w:color="BBBBBB"/>
+            </w:tcBorders>
+            <w:tcMar>
+              <w:top w:w="80" w:type="dxa"/>
+              <w:left w:w="110" w:type="dxa"/>
+              <w:bottom w:w="80" w:type="dxa"/>
+              <w:right w:w="110" w:type="dxa"/>
+            </w:tcMar>
+            <w:vAlign w:val="center"/>
+          </w:tcPr>
+          <w:p>
+            <w:r>
+              <w:t xml:space="preserve"> </w:t>
+            </w:r>
+            <w:r>
+              <w:t>O(n)</w:t>
+            </w:r>
+          </w:p>
+        </w:tc>
+        <w:tc>
+          <w:tcPr>
+            <w:tcW w:w="4260" w:type="dxa"/>
+            <w:tcBorders>
+              <w:top w:val="single" w:sz="1" w:space="0" w:color="BBBBBB"/>
+              <w:left w:val="single" w:sz="1" w:space="0" w:color="BBBBBB"/>
+              <w:bottom w:val="single" w:sz="1" w:space="0" w:color="BBBBBB"/>
+              <w:right w:val="single" w:sz="1" w:space="0" w:color="BBBBBB"/>
+            </w:tcBorders>
+            <w:tcMar>
+              <w:top w:w="80" w:type="dxa"/>
+              <w:left w:w="110" w:type="dxa"/>
+              <w:bottom w:w="80" w:type="dxa"/>
+              <w:right w:w="110" w:type="dxa"/>
+            </w:tcMar>
+            <w:vAlign w:val="center"/>
+          </w:tcPr>
+          <w:p>
+            <w:r>
+              <w:t xml:space="preserve"> </w:t>
+            </w:r>
+            <w:r>
+              <w:t>Linear growth</w:t>
+            </w:r>
+          </w:p>
+        </w:tc>
+      </w:tr>
+      <w:tr>
+        <w:tc>
+          <w:tcPr>
+            <w:tcW w:w="2700" w:type="dxa"/>
+            <w:tcBorders>
+              <w:top w:val="single" w:sz="1" w:space="0" w:color="BBBBBB"/>
+              <w:left w:val="single" w:sz="1" w:space="0" w:color="BBBBBB"/>
+              <w:bottom w:val="single" w:sz="1" w:space="0" w:color="BBBBBB"/>
+              <w:right w:val="single" w:sz="1" w:space="0" w:color="BBBBBB"/>
+            </w:tcBorders>
+            <w:tcMar>
+              <w:top w:w="80" w:type="dxa"/>
+              <w:left w:w="110" w:type="dxa"/>
+              <w:bottom w:w="80" w:type="dxa"/>
+              <w:right w:w="110" w:type="dxa"/>
+            </w:tcMar>
+            <w:vAlign w:val="center"/>
+          </w:tcPr>
+          <w:p>
             <w:r>
               <w:rPr>
                 <w:sz w:val="19"/>
                 <w:szCs w:val="19"/>
               </w:rPr>
-              <w:t>)</w:t>
+              <w:t>LinkedList.addFirst</w:t>
             </w:r>
           </w:p>
         </w:tc>
@@ -737,6 +981,9 @@
             <w:r>
               <w:t xml:space="preserve"> </w:t>
             </w:r>
+            <w:r>
+              <w:t>O(1)</w:t>
+            </w:r>
           </w:p>
         </w:tc>
         <w:tc>
@@ -758,18 +1005,12 @@
           </w:tcPr>
           <w:p>
             <w:r>
-              <w:t xml:space="preserve"> </w:t>
+              <w:t>Flat line</w:t>
             </w:r>
           </w:p>
         </w:tc>
       </w:tr>
       <w:tr>
-        <w:tblPrEx>
-          <w:tblCellMar>
-            <w:top w:w="0" w:type="dxa"/>
-            <w:bottom w:w="0" w:type="dxa"/>
-          </w:tblCellMar>
-        </w:tblPrEx>
         <w:tc>
           <w:tcPr>
             <w:tcW w:w="2700" w:type="dxa"/>
@@ -788,287 +1029,6 @@
             <w:vAlign w:val="center"/>
           </w:tcPr>
           <w:p>
-            <w:proofErr w:type="spellStart"/>
-            <w:r>
-              <w:rPr>
-                <w:sz w:val="19"/>
-                <w:szCs w:val="19"/>
-              </w:rPr>
-              <w:t>ArrayList.add</w:t>
-            </w:r>
-            <w:proofErr w:type="spellEnd"/>
-            <w:r>
-              <w:rPr>
-                <w:sz w:val="19"/>
-                <w:szCs w:val="19"/>
-              </w:rPr>
-              <w:t xml:space="preserve"> (at end)</w:t>
-            </w:r>
-          </w:p>
-        </w:tc>
-        <w:tc>
-          <w:tcPr>
-            <w:tcW w:w="2400" w:type="dxa"/>
-            <w:tcBorders>
-              <w:top w:val="single" w:sz="1" w:space="0" w:color="BBBBBB"/>
-              <w:left w:val="single" w:sz="1" w:space="0" w:color="BBBBBB"/>
-              <w:bottom w:val="single" w:sz="1" w:space="0" w:color="BBBBBB"/>
-              <w:right w:val="single" w:sz="1" w:space="0" w:color="BBBBBB"/>
-            </w:tcBorders>
-            <w:tcMar>
-              <w:top w:w="80" w:type="dxa"/>
-              <w:left w:w="110" w:type="dxa"/>
-              <w:bottom w:w="80" w:type="dxa"/>
-              <w:right w:w="110" w:type="dxa"/>
-            </w:tcMar>
-            <w:vAlign w:val="center"/>
-          </w:tcPr>
-          <w:p>
-            <w:r>
-              <w:t xml:space="preserve"> </w:t>
-            </w:r>
-          </w:p>
-        </w:tc>
-        <w:tc>
-          <w:tcPr>
-            <w:tcW w:w="4260" w:type="dxa"/>
-            <w:tcBorders>
-              <w:top w:val="single" w:sz="1" w:space="0" w:color="BBBBBB"/>
-              <w:left w:val="single" w:sz="1" w:space="0" w:color="BBBBBB"/>
-              <w:bottom w:val="single" w:sz="1" w:space="0" w:color="BBBBBB"/>
-              <w:right w:val="single" w:sz="1" w:space="0" w:color="BBBBBB"/>
-            </w:tcBorders>
-            <w:tcMar>
-              <w:top w:w="80" w:type="dxa"/>
-              <w:left w:w="110" w:type="dxa"/>
-              <w:bottom w:w="80" w:type="dxa"/>
-              <w:right w:w="110" w:type="dxa"/>
-            </w:tcMar>
-            <w:vAlign w:val="center"/>
-          </w:tcPr>
-          <w:p>
-            <w:r>
-              <w:t xml:space="preserve"> </w:t>
-            </w:r>
-          </w:p>
-        </w:tc>
-      </w:tr>
-      <w:tr>
-        <w:tblPrEx>
-          <w:tblCellMar>
-            <w:top w:w="0" w:type="dxa"/>
-            <w:bottom w:w="0" w:type="dxa"/>
-          </w:tblCellMar>
-        </w:tblPrEx>
-        <w:tc>
-          <w:tcPr>
-            <w:tcW w:w="2700" w:type="dxa"/>
-            <w:tcBorders>
-              <w:top w:val="single" w:sz="1" w:space="0" w:color="BBBBBB"/>
-              <w:left w:val="single" w:sz="1" w:space="0" w:color="BBBBBB"/>
-              <w:bottom w:val="single" w:sz="1" w:space="0" w:color="BBBBBB"/>
-              <w:right w:val="single" w:sz="1" w:space="0" w:color="BBBBBB"/>
-            </w:tcBorders>
-            <w:tcMar>
-              <w:top w:w="80" w:type="dxa"/>
-              <w:left w:w="110" w:type="dxa"/>
-              <w:bottom w:w="80" w:type="dxa"/>
-              <w:right w:w="110" w:type="dxa"/>
-            </w:tcMar>
-            <w:vAlign w:val="center"/>
-          </w:tcPr>
-          <w:p>
-            <w:proofErr w:type="spellStart"/>
-            <w:r>
-              <w:rPr>
-                <w:sz w:val="19"/>
-                <w:szCs w:val="19"/>
-              </w:rPr>
-              <w:t>LinkedList.get</w:t>
-            </w:r>
-            <w:proofErr w:type="spellEnd"/>
-            <w:r>
-              <w:rPr>
-                <w:sz w:val="19"/>
-                <w:szCs w:val="19"/>
-              </w:rPr>
-              <w:t>(</w:t>
-            </w:r>
-            <w:proofErr w:type="spellStart"/>
-            <w:r>
-              <w:rPr>
-                <w:sz w:val="19"/>
-                <w:szCs w:val="19"/>
-              </w:rPr>
-              <w:t>i</w:t>
-            </w:r>
-            <w:proofErr w:type="spellEnd"/>
-            <w:r>
-              <w:rPr>
-                <w:sz w:val="19"/>
-                <w:szCs w:val="19"/>
-              </w:rPr>
-              <w:t>)</w:t>
-            </w:r>
-          </w:p>
-        </w:tc>
-        <w:tc>
-          <w:tcPr>
-            <w:tcW w:w="2400" w:type="dxa"/>
-            <w:tcBorders>
-              <w:top w:val="single" w:sz="1" w:space="0" w:color="BBBBBB"/>
-              <w:left w:val="single" w:sz="1" w:space="0" w:color="BBBBBB"/>
-              <w:bottom w:val="single" w:sz="1" w:space="0" w:color="BBBBBB"/>
-              <w:right w:val="single" w:sz="1" w:space="0" w:color="BBBBBB"/>
-            </w:tcBorders>
-            <w:tcMar>
-              <w:top w:w="80" w:type="dxa"/>
-              <w:left w:w="110" w:type="dxa"/>
-              <w:bottom w:w="80" w:type="dxa"/>
-              <w:right w:w="110" w:type="dxa"/>
-            </w:tcMar>
-            <w:vAlign w:val="center"/>
-          </w:tcPr>
-          <w:p>
-            <w:r>
-              <w:t xml:space="preserve"> </w:t>
-            </w:r>
-          </w:p>
-        </w:tc>
-        <w:tc>
-          <w:tcPr>
-            <w:tcW w:w="4260" w:type="dxa"/>
-            <w:tcBorders>
-              <w:top w:val="single" w:sz="1" w:space="0" w:color="BBBBBB"/>
-              <w:left w:val="single" w:sz="1" w:space="0" w:color="BBBBBB"/>
-              <w:bottom w:val="single" w:sz="1" w:space="0" w:color="BBBBBB"/>
-              <w:right w:val="single" w:sz="1" w:space="0" w:color="BBBBBB"/>
-            </w:tcBorders>
-            <w:tcMar>
-              <w:top w:w="80" w:type="dxa"/>
-              <w:left w:w="110" w:type="dxa"/>
-              <w:bottom w:w="80" w:type="dxa"/>
-              <w:right w:w="110" w:type="dxa"/>
-            </w:tcMar>
-            <w:vAlign w:val="center"/>
-          </w:tcPr>
-          <w:p>
-            <w:r>
-              <w:t xml:space="preserve"> </w:t>
-            </w:r>
-          </w:p>
-        </w:tc>
-      </w:tr>
-      <w:tr>
-        <w:tblPrEx>
-          <w:tblCellMar>
-            <w:top w:w="0" w:type="dxa"/>
-            <w:bottom w:w="0" w:type="dxa"/>
-          </w:tblCellMar>
-        </w:tblPrEx>
-        <w:tc>
-          <w:tcPr>
-            <w:tcW w:w="2700" w:type="dxa"/>
-            <w:tcBorders>
-              <w:top w:val="single" w:sz="1" w:space="0" w:color="BBBBBB"/>
-              <w:left w:val="single" w:sz="1" w:space="0" w:color="BBBBBB"/>
-              <w:bottom w:val="single" w:sz="1" w:space="0" w:color="BBBBBB"/>
-              <w:right w:val="single" w:sz="1" w:space="0" w:color="BBBBBB"/>
-            </w:tcBorders>
-            <w:tcMar>
-              <w:top w:w="80" w:type="dxa"/>
-              <w:left w:w="110" w:type="dxa"/>
-              <w:bottom w:w="80" w:type="dxa"/>
-              <w:right w:w="110" w:type="dxa"/>
-            </w:tcMar>
-            <w:vAlign w:val="center"/>
-          </w:tcPr>
-          <w:p>
-            <w:proofErr w:type="spellStart"/>
-            <w:r>
-              <w:rPr>
-                <w:sz w:val="19"/>
-                <w:szCs w:val="19"/>
-              </w:rPr>
-              <w:lastRenderedPageBreak/>
-              <w:t>LinkedList.addFirst</w:t>
-            </w:r>
-            <w:proofErr w:type="spellEnd"/>
-          </w:p>
-        </w:tc>
-        <w:tc>
-          <w:tcPr>
-            <w:tcW w:w="2400" w:type="dxa"/>
-            <w:tcBorders>
-              <w:top w:val="single" w:sz="1" w:space="0" w:color="BBBBBB"/>
-              <w:left w:val="single" w:sz="1" w:space="0" w:color="BBBBBB"/>
-              <w:bottom w:val="single" w:sz="1" w:space="0" w:color="BBBBBB"/>
-              <w:right w:val="single" w:sz="1" w:space="0" w:color="BBBBBB"/>
-            </w:tcBorders>
-            <w:tcMar>
-              <w:top w:w="80" w:type="dxa"/>
-              <w:left w:w="110" w:type="dxa"/>
-              <w:bottom w:w="80" w:type="dxa"/>
-              <w:right w:w="110" w:type="dxa"/>
-            </w:tcMar>
-            <w:vAlign w:val="center"/>
-          </w:tcPr>
-          <w:p>
-            <w:r>
-              <w:t xml:space="preserve"> </w:t>
-            </w:r>
-          </w:p>
-        </w:tc>
-        <w:tc>
-          <w:tcPr>
-            <w:tcW w:w="4260" w:type="dxa"/>
-            <w:tcBorders>
-              <w:top w:val="single" w:sz="1" w:space="0" w:color="BBBBBB"/>
-              <w:left w:val="single" w:sz="1" w:space="0" w:color="BBBBBB"/>
-              <w:bottom w:val="single" w:sz="1" w:space="0" w:color="BBBBBB"/>
-              <w:right w:val="single" w:sz="1" w:space="0" w:color="BBBBBB"/>
-            </w:tcBorders>
-            <w:tcMar>
-              <w:top w:w="80" w:type="dxa"/>
-              <w:left w:w="110" w:type="dxa"/>
-              <w:bottom w:w="80" w:type="dxa"/>
-              <w:right w:w="110" w:type="dxa"/>
-            </w:tcMar>
-            <w:vAlign w:val="center"/>
-          </w:tcPr>
-          <w:p>
-            <w:r>
-              <w:t xml:space="preserve"> </w:t>
-            </w:r>
-          </w:p>
-        </w:tc>
-      </w:tr>
-      <w:tr>
-        <w:tblPrEx>
-          <w:tblCellMar>
-            <w:top w:w="0" w:type="dxa"/>
-            <w:bottom w:w="0" w:type="dxa"/>
-          </w:tblCellMar>
-        </w:tblPrEx>
-        <w:tc>
-          <w:tcPr>
-            <w:tcW w:w="2700" w:type="dxa"/>
-            <w:tcBorders>
-              <w:top w:val="single" w:sz="1" w:space="0" w:color="BBBBBB"/>
-              <w:left w:val="single" w:sz="1" w:space="0" w:color="BBBBBB"/>
-              <w:bottom w:val="single" w:sz="1" w:space="0" w:color="BBBBBB"/>
-              <w:right w:val="single" w:sz="1" w:space="0" w:color="BBBBBB"/>
-            </w:tcBorders>
-            <w:tcMar>
-              <w:top w:w="80" w:type="dxa"/>
-              <w:left w:w="110" w:type="dxa"/>
-              <w:bottom w:w="80" w:type="dxa"/>
-              <w:right w:w="110" w:type="dxa"/>
-            </w:tcMar>
-            <w:vAlign w:val="center"/>
-          </w:tcPr>
-          <w:p>
-            <w:proofErr w:type="spellStart"/>
             <w:r>
               <w:rPr>
                 <w:sz w:val="19"/>
@@ -1076,7 +1036,6 @@
               </w:rPr>
               <w:t>HashSet.contains</w:t>
             </w:r>
-            <w:proofErr w:type="spellEnd"/>
           </w:p>
         </w:tc>
         <w:tc>
@@ -1100,6 +1059,9 @@
             <w:r>
               <w:t xml:space="preserve"> </w:t>
             </w:r>
+            <w:r>
+              <w:t>O(1) average</w:t>
+            </w:r>
           </w:p>
         </w:tc>
         <w:tc>
@@ -1122,17 +1084,14 @@
           <w:p>
             <w:r>
               <w:t xml:space="preserve"> </w:t>
+            </w:r>
+            <w:r>
+              <w:t>Mostly flat</w:t>
             </w:r>
           </w:p>
         </w:tc>
       </w:tr>
       <w:tr>
-        <w:tblPrEx>
-          <w:tblCellMar>
-            <w:top w:w="0" w:type="dxa"/>
-            <w:bottom w:w="0" w:type="dxa"/>
-          </w:tblCellMar>
-        </w:tblPrEx>
         <w:tc>
           <w:tcPr>
             <w:tcW w:w="2700" w:type="dxa"/>
@@ -1151,7 +1110,6 @@
             <w:vAlign w:val="center"/>
           </w:tcPr>
           <w:p>
-            <w:proofErr w:type="spellStart"/>
             <w:r>
               <w:rPr>
                 <w:sz w:val="19"/>
@@ -1159,7 +1117,6 @@
               </w:rPr>
               <w:t>TreeSet.contains</w:t>
             </w:r>
-            <w:proofErr w:type="spellEnd"/>
           </w:p>
         </w:tc>
         <w:tc>
@@ -1183,6 +1140,9 @@
             <w:r>
               <w:t xml:space="preserve"> </w:t>
             </w:r>
+            <w:r>
+              <w:t>O(log n)</w:t>
+            </w:r>
           </w:p>
         </w:tc>
         <w:tc>
@@ -1205,17 +1165,14 @@
           <w:p>
             <w:r>
               <w:t xml:space="preserve"> </w:t>
+            </w:r>
+            <w:r>
+              <w:t>Slow logarithmic growth</w:t>
             </w:r>
           </w:p>
         </w:tc>
       </w:tr>
       <w:tr>
-        <w:tblPrEx>
-          <w:tblCellMar>
-            <w:top w:w="0" w:type="dxa"/>
-            <w:bottom w:w="0" w:type="dxa"/>
-          </w:tblCellMar>
-        </w:tblPrEx>
         <w:tc>
           <w:tcPr>
             <w:tcW w:w="2700" w:type="dxa"/>
@@ -1234,7 +1191,6 @@
             <w:vAlign w:val="center"/>
           </w:tcPr>
           <w:p>
-            <w:proofErr w:type="spellStart"/>
             <w:r>
               <w:rPr>
                 <w:sz w:val="19"/>
@@ -1242,7 +1198,6 @@
               </w:rPr>
               <w:t>HashMap.get</w:t>
             </w:r>
-            <w:proofErr w:type="spellEnd"/>
           </w:p>
         </w:tc>
         <w:tc>
@@ -1266,6 +1221,9 @@
             <w:r>
               <w:t xml:space="preserve"> </w:t>
             </w:r>
+            <w:r>
+              <w:t>O(1) average</w:t>
+            </w:r>
           </w:p>
         </w:tc>
         <w:tc>
@@ -1288,17 +1246,14 @@
           <w:p>
             <w:r>
               <w:t xml:space="preserve"> </w:t>
+            </w:r>
+            <w:r>
+              <w:t>Mostly flat</w:t>
             </w:r>
           </w:p>
         </w:tc>
       </w:tr>
       <w:tr>
-        <w:tblPrEx>
-          <w:tblCellMar>
-            <w:top w:w="0" w:type="dxa"/>
-            <w:bottom w:w="0" w:type="dxa"/>
-          </w:tblCellMar>
-        </w:tblPrEx>
         <w:tc>
           <w:tcPr>
             <w:tcW w:w="2700" w:type="dxa"/>
@@ -1317,7 +1272,6 @@
             <w:vAlign w:val="center"/>
           </w:tcPr>
           <w:p>
-            <w:proofErr w:type="spellStart"/>
             <w:r>
               <w:rPr>
                 <w:sz w:val="19"/>
@@ -1325,7 +1279,6 @@
               </w:rPr>
               <w:t>TreeMap.get</w:t>
             </w:r>
-            <w:proofErr w:type="spellEnd"/>
           </w:p>
         </w:tc>
         <w:tc>
@@ -1349,6 +1302,9 @@
             <w:r>
               <w:t xml:space="preserve"> </w:t>
             </w:r>
+            <w:r>
+              <w:t>O(log n)</w:t>
+            </w:r>
           </w:p>
         </w:tc>
         <w:tc>
@@ -1371,17 +1327,14 @@
           <w:p>
             <w:r>
               <w:t xml:space="preserve"> </w:t>
+            </w:r>
+            <w:r>
+              <w:t>Slow logarithmic growth</w:t>
             </w:r>
           </w:p>
         </w:tc>
       </w:tr>
       <w:tr>
-        <w:tblPrEx>
-          <w:tblCellMar>
-            <w:top w:w="0" w:type="dxa"/>
-            <w:bottom w:w="0" w:type="dxa"/>
-          </w:tblCellMar>
-        </w:tblPrEx>
         <w:tc>
           <w:tcPr>
             <w:tcW w:w="2700" w:type="dxa"/>
@@ -1400,7 +1353,6 @@
             <w:vAlign w:val="center"/>
           </w:tcPr>
           <w:p>
-            <w:proofErr w:type="spellStart"/>
             <w:r>
               <w:rPr>
                 <w:sz w:val="19"/>
@@ -1408,7 +1360,6 @@
               </w:rPr>
               <w:t>PriorityQueue.offer</w:t>
             </w:r>
-            <w:proofErr w:type="spellEnd"/>
           </w:p>
         </w:tc>
         <w:tc>
@@ -1432,6 +1383,12 @@
             <w:r>
               <w:t xml:space="preserve"> </w:t>
             </w:r>
+            <w:r>
+              <w:t>O(log n</w:t>
+            </w:r>
+            <w:r>
+              <w:t>)</w:t>
+            </w:r>
           </w:p>
         </w:tc>
         <w:tc>
@@ -1454,17 +1411,14 @@
           <w:p>
             <w:r>
               <w:t xml:space="preserve"> </w:t>
+            </w:r>
+            <w:r>
+              <w:t>Slow logarithmic growth</w:t>
             </w:r>
           </w:p>
         </w:tc>
       </w:tr>
       <w:tr>
-        <w:tblPrEx>
-          <w:tblCellMar>
-            <w:top w:w="0" w:type="dxa"/>
-            <w:bottom w:w="0" w:type="dxa"/>
-          </w:tblCellMar>
-        </w:tblPrEx>
         <w:tc>
           <w:tcPr>
             <w:tcW w:w="2700" w:type="dxa"/>
@@ -1483,7 +1437,6 @@
             <w:vAlign w:val="center"/>
           </w:tcPr>
           <w:p>
-            <w:proofErr w:type="spellStart"/>
             <w:r>
               <w:rPr>
                 <w:sz w:val="19"/>
@@ -1491,7 +1444,6 @@
               </w:rPr>
               <w:t>PriorityQueue.peek</w:t>
             </w:r>
-            <w:proofErr w:type="spellEnd"/>
           </w:p>
         </w:tc>
         <w:tc>
@@ -1515,6 +1467,9 @@
             <w:r>
               <w:t xml:space="preserve"> </w:t>
             </w:r>
+            <w:r>
+              <w:t>O(1)</w:t>
+            </w:r>
           </w:p>
         </w:tc>
         <w:tc>
@@ -1537,6 +1492,9 @@
           <w:p>
             <w:r>
               <w:t xml:space="preserve"> </w:t>
+            </w:r>
+            <w:r>
+              <w:t>Flat line</w:t>
             </w:r>
           </w:p>
         </w:tc>
@@ -1573,13 +1531,1225 @@
     <w:p>
       <w:pPr>
         <w:spacing w:after="120"/>
-      </w:pPr>
-      <w:r>
         <w:rPr>
           <w:b/>
           <w:bCs/>
         </w:rPr>
+      </w:pPr>
+      <w:r>
+        <w:rPr>
+          <w:b/>
+          <w:bCs/>
+        </w:rPr>
         <w:t>Did the measured curves match your predictions? Where did they differ, and why? (mention warm-up, cache, constant factors if relevant)</w:t>
+      </w:r>
+    </w:p>
+    <w:p>
+      <w:pPr>
+        <w:shd w:val="clear" w:color="auto" w:fill="000000" w:themeFill="text1"/>
+        <w:spacing w:after="120" w:line="240" w:lineRule="auto"/>
+        <w:rPr>
+          <w:sz w:val="8"/>
+          <w:szCs w:val="8"/>
+        </w:rPr>
+      </w:pPr>
+      <w:r>
+        <w:rPr>
+          <w:sz w:val="8"/>
+          <w:szCs w:val="8"/>
+        </w:rPr>
+        <w:t>Collection,Operation,n,Time_ns</w:t>
+      </w:r>
+    </w:p>
+    <w:p>
+      <w:pPr>
+        <w:shd w:val="clear" w:color="auto" w:fill="000000" w:themeFill="text1"/>
+        <w:spacing w:after="120" w:line="240" w:lineRule="auto"/>
+        <w:rPr>
+          <w:sz w:val="8"/>
+          <w:szCs w:val="8"/>
+        </w:rPr>
+      </w:pPr>
+      <w:r>
+        <w:rPr>
+          <w:sz w:val="8"/>
+          <w:szCs w:val="8"/>
+        </w:rPr>
+        <w:t>ArrayList,get,1000,30</w:t>
+      </w:r>
+    </w:p>
+    <w:p>
+      <w:pPr>
+        <w:shd w:val="clear" w:color="auto" w:fill="000000" w:themeFill="text1"/>
+        <w:spacing w:after="120" w:line="240" w:lineRule="auto"/>
+        <w:rPr>
+          <w:sz w:val="8"/>
+          <w:szCs w:val="8"/>
+        </w:rPr>
+      </w:pPr>
+      <w:r>
+        <w:rPr>
+          <w:sz w:val="8"/>
+          <w:szCs w:val="8"/>
+        </w:rPr>
+        <w:t>ArrayList,add_end,1000,5</w:t>
+      </w:r>
+    </w:p>
+    <w:p>
+      <w:pPr>
+        <w:shd w:val="clear" w:color="auto" w:fill="000000" w:themeFill="text1"/>
+        <w:spacing w:after="120" w:line="240" w:lineRule="auto"/>
+        <w:rPr>
+          <w:sz w:val="8"/>
+          <w:szCs w:val="8"/>
+        </w:rPr>
+      </w:pPr>
+      <w:r>
+        <w:rPr>
+          <w:sz w:val="8"/>
+          <w:szCs w:val="8"/>
+        </w:rPr>
+        <w:t>ArrayList,get,5000,28</w:t>
+      </w:r>
+    </w:p>
+    <w:p>
+      <w:pPr>
+        <w:shd w:val="clear" w:color="auto" w:fill="000000" w:themeFill="text1"/>
+        <w:spacing w:after="120" w:line="240" w:lineRule="auto"/>
+        <w:rPr>
+          <w:sz w:val="8"/>
+          <w:szCs w:val="8"/>
+        </w:rPr>
+      </w:pPr>
+      <w:r>
+        <w:rPr>
+          <w:sz w:val="8"/>
+          <w:szCs w:val="8"/>
+        </w:rPr>
+        <w:t>ArrayList,add_end,5000,3</w:t>
+      </w:r>
+    </w:p>
+    <w:p>
+      <w:pPr>
+        <w:shd w:val="clear" w:color="auto" w:fill="000000" w:themeFill="text1"/>
+        <w:spacing w:after="120" w:line="240" w:lineRule="auto"/>
+        <w:rPr>
+          <w:sz w:val="8"/>
+          <w:szCs w:val="8"/>
+        </w:rPr>
+      </w:pPr>
+      <w:r>
+        <w:rPr>
+          <w:sz w:val="8"/>
+          <w:szCs w:val="8"/>
+        </w:rPr>
+        <w:t>ArrayList,get,10000,28</w:t>
+      </w:r>
+    </w:p>
+    <w:p>
+      <w:pPr>
+        <w:shd w:val="clear" w:color="auto" w:fill="000000" w:themeFill="text1"/>
+        <w:spacing w:after="120" w:line="240" w:lineRule="auto"/>
+        <w:rPr>
+          <w:sz w:val="8"/>
+          <w:szCs w:val="8"/>
+        </w:rPr>
+      </w:pPr>
+      <w:r>
+        <w:rPr>
+          <w:sz w:val="8"/>
+          <w:szCs w:val="8"/>
+        </w:rPr>
+        <w:t>ArrayList,add_end,10000,3</w:t>
+      </w:r>
+    </w:p>
+    <w:p>
+      <w:pPr>
+        <w:shd w:val="clear" w:color="auto" w:fill="000000" w:themeFill="text1"/>
+        <w:spacing w:after="120" w:line="240" w:lineRule="auto"/>
+        <w:rPr>
+          <w:sz w:val="8"/>
+          <w:szCs w:val="8"/>
+        </w:rPr>
+      </w:pPr>
+      <w:r>
+        <w:rPr>
+          <w:sz w:val="8"/>
+          <w:szCs w:val="8"/>
+        </w:rPr>
+        <w:t>ArrayList,get,50000,19</w:t>
+      </w:r>
+    </w:p>
+    <w:p>
+      <w:pPr>
+        <w:shd w:val="clear" w:color="auto" w:fill="000000" w:themeFill="text1"/>
+        <w:spacing w:after="120" w:line="240" w:lineRule="auto"/>
+        <w:rPr>
+          <w:sz w:val="8"/>
+          <w:szCs w:val="8"/>
+        </w:rPr>
+      </w:pPr>
+      <w:r>
+        <w:rPr>
+          <w:sz w:val="8"/>
+          <w:szCs w:val="8"/>
+        </w:rPr>
+        <w:t>ArrayList,add_end,50000,3</w:t>
+      </w:r>
+    </w:p>
+    <w:p>
+      <w:pPr>
+        <w:shd w:val="clear" w:color="auto" w:fill="000000" w:themeFill="text1"/>
+        <w:spacing w:after="120" w:line="240" w:lineRule="auto"/>
+        <w:rPr>
+          <w:sz w:val="8"/>
+          <w:szCs w:val="8"/>
+        </w:rPr>
+      </w:pPr>
+      <w:r>
+        <w:rPr>
+          <w:sz w:val="8"/>
+          <w:szCs w:val="8"/>
+        </w:rPr>
+        <w:t>ArrayList,get,100000,19</w:t>
+      </w:r>
+    </w:p>
+    <w:p>
+      <w:pPr>
+        <w:shd w:val="clear" w:color="auto" w:fill="000000" w:themeFill="text1"/>
+        <w:spacing w:after="120" w:line="240" w:lineRule="auto"/>
+        <w:rPr>
+          <w:sz w:val="8"/>
+          <w:szCs w:val="8"/>
+        </w:rPr>
+      </w:pPr>
+      <w:r>
+        <w:rPr>
+          <w:sz w:val="8"/>
+          <w:szCs w:val="8"/>
+        </w:rPr>
+        <w:t>ArrayList,add_end,100000,2</w:t>
+      </w:r>
+    </w:p>
+    <w:p>
+      <w:pPr>
+        <w:shd w:val="clear" w:color="auto" w:fill="000000" w:themeFill="text1"/>
+        <w:spacing w:after="120" w:line="240" w:lineRule="auto"/>
+        <w:rPr>
+          <w:sz w:val="8"/>
+          <w:szCs w:val="8"/>
+        </w:rPr>
+      </w:pPr>
+      <w:r>
+        <w:rPr>
+          <w:sz w:val="8"/>
+          <w:szCs w:val="8"/>
+        </w:rPr>
+        <w:t>ArrayList,get,500000,16</w:t>
+      </w:r>
+    </w:p>
+    <w:p>
+      <w:pPr>
+        <w:shd w:val="clear" w:color="auto" w:fill="000000" w:themeFill="text1"/>
+        <w:spacing w:after="120" w:line="240" w:lineRule="auto"/>
+        <w:rPr>
+          <w:sz w:val="8"/>
+          <w:szCs w:val="8"/>
+        </w:rPr>
+      </w:pPr>
+      <w:r>
+        <w:rPr>
+          <w:sz w:val="8"/>
+          <w:szCs w:val="8"/>
+        </w:rPr>
+        <w:lastRenderedPageBreak/>
+        <w:t>ArrayList,add_end,500000,15</w:t>
+      </w:r>
+    </w:p>
+    <w:p>
+      <w:pPr>
+        <w:shd w:val="clear" w:color="auto" w:fill="000000" w:themeFill="text1"/>
+        <w:spacing w:after="120" w:line="240" w:lineRule="auto"/>
+        <w:rPr>
+          <w:sz w:val="8"/>
+          <w:szCs w:val="8"/>
+        </w:rPr>
+      </w:pPr>
+      <w:r>
+        <w:rPr>
+          <w:sz w:val="8"/>
+          <w:szCs w:val="8"/>
+        </w:rPr>
+        <w:t>ArrayList,get,1000000,20</w:t>
+      </w:r>
+    </w:p>
+    <w:p>
+      <w:pPr>
+        <w:shd w:val="clear" w:color="auto" w:fill="000000" w:themeFill="text1"/>
+        <w:spacing w:after="120" w:line="240" w:lineRule="auto"/>
+        <w:rPr>
+          <w:sz w:val="8"/>
+          <w:szCs w:val="8"/>
+        </w:rPr>
+      </w:pPr>
+      <w:r>
+        <w:rPr>
+          <w:sz w:val="8"/>
+          <w:szCs w:val="8"/>
+        </w:rPr>
+        <w:t>ArrayList,add_end,1000000,20</w:t>
+      </w:r>
+    </w:p>
+    <w:p>
+      <w:pPr>
+        <w:shd w:val="clear" w:color="auto" w:fill="000000" w:themeFill="text1"/>
+        <w:spacing w:after="120" w:line="240" w:lineRule="auto"/>
+        <w:rPr>
+          <w:sz w:val="8"/>
+          <w:szCs w:val="8"/>
+        </w:rPr>
+      </w:pPr>
+      <w:r>
+        <w:rPr>
+          <w:sz w:val="8"/>
+          <w:szCs w:val="8"/>
+        </w:rPr>
+        <w:t>LinkedList,get,1000,689</w:t>
+      </w:r>
+    </w:p>
+    <w:p>
+      <w:pPr>
+        <w:shd w:val="clear" w:color="auto" w:fill="000000" w:themeFill="text1"/>
+        <w:spacing w:after="120" w:line="240" w:lineRule="auto"/>
+        <w:rPr>
+          <w:sz w:val="8"/>
+          <w:szCs w:val="8"/>
+        </w:rPr>
+      </w:pPr>
+      <w:r>
+        <w:rPr>
+          <w:sz w:val="8"/>
+          <w:szCs w:val="8"/>
+        </w:rPr>
+        <w:t>LinkedList,addFirst,1000,7</w:t>
+      </w:r>
+    </w:p>
+    <w:p>
+      <w:pPr>
+        <w:shd w:val="clear" w:color="auto" w:fill="000000" w:themeFill="text1"/>
+        <w:spacing w:after="120" w:line="240" w:lineRule="auto"/>
+        <w:rPr>
+          <w:sz w:val="8"/>
+          <w:szCs w:val="8"/>
+        </w:rPr>
+      </w:pPr>
+      <w:r>
+        <w:rPr>
+          <w:sz w:val="8"/>
+          <w:szCs w:val="8"/>
+        </w:rPr>
+        <w:t>LinkedList,get,5000,2875</w:t>
+      </w:r>
+    </w:p>
+    <w:p>
+      <w:pPr>
+        <w:shd w:val="clear" w:color="auto" w:fill="000000" w:themeFill="text1"/>
+        <w:spacing w:after="120" w:line="240" w:lineRule="auto"/>
+        <w:rPr>
+          <w:sz w:val="8"/>
+          <w:szCs w:val="8"/>
+        </w:rPr>
+      </w:pPr>
+      <w:r>
+        <w:rPr>
+          <w:sz w:val="8"/>
+          <w:szCs w:val="8"/>
+        </w:rPr>
+        <w:t>LinkedList,addFirst,5000,4</w:t>
+      </w:r>
+    </w:p>
+    <w:p>
+      <w:pPr>
+        <w:shd w:val="clear" w:color="auto" w:fill="000000" w:themeFill="text1"/>
+        <w:spacing w:after="120" w:line="240" w:lineRule="auto"/>
+        <w:rPr>
+          <w:sz w:val="8"/>
+          <w:szCs w:val="8"/>
+        </w:rPr>
+      </w:pPr>
+      <w:r>
+        <w:rPr>
+          <w:sz w:val="8"/>
+          <w:szCs w:val="8"/>
+        </w:rPr>
+        <w:t>LinkedList,get,10000,7453</w:t>
+      </w:r>
+    </w:p>
+    <w:p>
+      <w:pPr>
+        <w:shd w:val="clear" w:color="auto" w:fill="000000" w:themeFill="text1"/>
+        <w:spacing w:after="120" w:line="240" w:lineRule="auto"/>
+        <w:rPr>
+          <w:sz w:val="8"/>
+          <w:szCs w:val="8"/>
+        </w:rPr>
+      </w:pPr>
+      <w:r>
+        <w:rPr>
+          <w:sz w:val="8"/>
+          <w:szCs w:val="8"/>
+        </w:rPr>
+        <w:t>LinkedList,addFirst,10000,4</w:t>
+      </w:r>
+    </w:p>
+    <w:p>
+      <w:pPr>
+        <w:shd w:val="clear" w:color="auto" w:fill="000000" w:themeFill="text1"/>
+        <w:spacing w:after="120" w:line="240" w:lineRule="auto"/>
+        <w:rPr>
+          <w:sz w:val="8"/>
+          <w:szCs w:val="8"/>
+        </w:rPr>
+      </w:pPr>
+      <w:r>
+        <w:rPr>
+          <w:sz w:val="8"/>
+          <w:szCs w:val="8"/>
+        </w:rPr>
+        <w:t>LinkedList,get,50000,33640</w:t>
+      </w:r>
+    </w:p>
+    <w:p>
+      <w:pPr>
+        <w:shd w:val="clear" w:color="auto" w:fill="000000" w:themeFill="text1"/>
+        <w:spacing w:after="120" w:line="240" w:lineRule="auto"/>
+        <w:rPr>
+          <w:sz w:val="8"/>
+          <w:szCs w:val="8"/>
+        </w:rPr>
+      </w:pPr>
+      <w:r>
+        <w:rPr>
+          <w:sz w:val="8"/>
+          <w:szCs w:val="8"/>
+        </w:rPr>
+        <w:t>LinkedList,addFirst,50000,4</w:t>
+      </w:r>
+    </w:p>
+    <w:p>
+      <w:pPr>
+        <w:shd w:val="clear" w:color="auto" w:fill="000000" w:themeFill="text1"/>
+        <w:spacing w:after="120" w:line="240" w:lineRule="auto"/>
+        <w:rPr>
+          <w:sz w:val="8"/>
+          <w:szCs w:val="8"/>
+        </w:rPr>
+      </w:pPr>
+      <w:r>
+        <w:rPr>
+          <w:sz w:val="8"/>
+          <w:szCs w:val="8"/>
+        </w:rPr>
+        <w:t>LinkedList,get,100000,67800</w:t>
+      </w:r>
+    </w:p>
+    <w:p>
+      <w:pPr>
+        <w:shd w:val="clear" w:color="auto" w:fill="000000" w:themeFill="text1"/>
+        <w:spacing w:after="120" w:line="240" w:lineRule="auto"/>
+        <w:rPr>
+          <w:sz w:val="8"/>
+          <w:szCs w:val="8"/>
+        </w:rPr>
+      </w:pPr>
+      <w:r>
+        <w:rPr>
+          <w:sz w:val="8"/>
+          <w:szCs w:val="8"/>
+        </w:rPr>
+        <w:t>LinkedList,addFirst,100000,4</w:t>
+      </w:r>
+    </w:p>
+    <w:p>
+      <w:pPr>
+        <w:shd w:val="clear" w:color="auto" w:fill="000000" w:themeFill="text1"/>
+        <w:spacing w:after="120" w:line="240" w:lineRule="auto"/>
+        <w:rPr>
+          <w:sz w:val="8"/>
+          <w:szCs w:val="8"/>
+        </w:rPr>
+      </w:pPr>
+      <w:r>
+        <w:rPr>
+          <w:sz w:val="8"/>
+          <w:szCs w:val="8"/>
+        </w:rPr>
+        <w:t>LinkedList,get,500000,379947</w:t>
+      </w:r>
+    </w:p>
+    <w:p>
+      <w:pPr>
+        <w:shd w:val="clear" w:color="auto" w:fill="000000" w:themeFill="text1"/>
+        <w:spacing w:after="120" w:line="240" w:lineRule="auto"/>
+        <w:rPr>
+          <w:sz w:val="8"/>
+          <w:szCs w:val="8"/>
+        </w:rPr>
+      </w:pPr>
+      <w:r>
+        <w:rPr>
+          <w:sz w:val="8"/>
+          <w:szCs w:val="8"/>
+        </w:rPr>
+        <w:t>LinkedList,addFirst,500000,4</w:t>
+      </w:r>
+    </w:p>
+    <w:p>
+      <w:pPr>
+        <w:shd w:val="clear" w:color="auto" w:fill="000000" w:themeFill="text1"/>
+        <w:spacing w:after="120" w:line="240" w:lineRule="auto"/>
+        <w:rPr>
+          <w:sz w:val="8"/>
+          <w:szCs w:val="8"/>
+        </w:rPr>
+      </w:pPr>
+      <w:r>
+        <w:rPr>
+          <w:sz w:val="8"/>
+          <w:szCs w:val="8"/>
+        </w:rPr>
+        <w:t>LinkedList,get,1000000,809109</w:t>
+      </w:r>
+    </w:p>
+    <w:p>
+      <w:pPr>
+        <w:shd w:val="clear" w:color="auto" w:fill="000000" w:themeFill="text1"/>
+        <w:spacing w:after="120" w:line="240" w:lineRule="auto"/>
+        <w:rPr>
+          <w:sz w:val="8"/>
+          <w:szCs w:val="8"/>
+        </w:rPr>
+      </w:pPr>
+      <w:r>
+        <w:rPr>
+          <w:sz w:val="8"/>
+          <w:szCs w:val="8"/>
+        </w:rPr>
+        <w:t>LinkedList,addFirst,1000000,3</w:t>
+      </w:r>
+    </w:p>
+    <w:p>
+      <w:pPr>
+        <w:shd w:val="clear" w:color="auto" w:fill="000000" w:themeFill="text1"/>
+        <w:spacing w:after="120" w:line="240" w:lineRule="auto"/>
+        <w:rPr>
+          <w:sz w:val="8"/>
+          <w:szCs w:val="8"/>
+        </w:rPr>
+      </w:pPr>
+      <w:r>
+        <w:rPr>
+          <w:sz w:val="8"/>
+          <w:szCs w:val="8"/>
+        </w:rPr>
+        <w:t>HashSet,contains,1000,50</w:t>
+      </w:r>
+    </w:p>
+    <w:p>
+      <w:pPr>
+        <w:shd w:val="clear" w:color="auto" w:fill="000000" w:themeFill="text1"/>
+        <w:spacing w:after="120" w:line="240" w:lineRule="auto"/>
+        <w:rPr>
+          <w:sz w:val="8"/>
+          <w:szCs w:val="8"/>
+        </w:rPr>
+      </w:pPr>
+      <w:r>
+        <w:rPr>
+          <w:sz w:val="8"/>
+          <w:szCs w:val="8"/>
+        </w:rPr>
+        <w:t>HashSet,contains,5000,36</w:t>
+      </w:r>
+    </w:p>
+    <w:p>
+      <w:pPr>
+        <w:shd w:val="clear" w:color="auto" w:fill="000000" w:themeFill="text1"/>
+        <w:spacing w:after="120" w:line="240" w:lineRule="auto"/>
+        <w:rPr>
+          <w:sz w:val="8"/>
+          <w:szCs w:val="8"/>
+        </w:rPr>
+      </w:pPr>
+      <w:r>
+        <w:rPr>
+          <w:sz w:val="8"/>
+          <w:szCs w:val="8"/>
+        </w:rPr>
+        <w:t>HashSet,contains,10000,64</w:t>
+      </w:r>
+    </w:p>
+    <w:p>
+      <w:pPr>
+        <w:shd w:val="clear" w:color="auto" w:fill="000000" w:themeFill="text1"/>
+        <w:spacing w:after="120" w:line="240" w:lineRule="auto"/>
+        <w:rPr>
+          <w:sz w:val="8"/>
+          <w:szCs w:val="8"/>
+        </w:rPr>
+      </w:pPr>
+      <w:r>
+        <w:rPr>
+          <w:sz w:val="8"/>
+          <w:szCs w:val="8"/>
+        </w:rPr>
+        <w:t>HashSet,contains,50000,29</w:t>
+      </w:r>
+    </w:p>
+    <w:p>
+      <w:pPr>
+        <w:shd w:val="clear" w:color="auto" w:fill="000000" w:themeFill="text1"/>
+        <w:spacing w:after="120" w:line="240" w:lineRule="auto"/>
+        <w:rPr>
+          <w:sz w:val="8"/>
+          <w:szCs w:val="8"/>
+        </w:rPr>
+      </w:pPr>
+      <w:r>
+        <w:rPr>
+          <w:sz w:val="8"/>
+          <w:szCs w:val="8"/>
+        </w:rPr>
+        <w:t>HashSet,contains,100000,24</w:t>
+      </w:r>
+    </w:p>
+    <w:p>
+      <w:pPr>
+        <w:shd w:val="clear" w:color="auto" w:fill="000000" w:themeFill="text1"/>
+        <w:spacing w:after="120" w:line="240" w:lineRule="auto"/>
+        <w:rPr>
+          <w:sz w:val="8"/>
+          <w:szCs w:val="8"/>
+        </w:rPr>
+      </w:pPr>
+      <w:r>
+        <w:rPr>
+          <w:sz w:val="8"/>
+          <w:szCs w:val="8"/>
+        </w:rPr>
+        <w:t>HashSet,contains,500000,32</w:t>
+      </w:r>
+    </w:p>
+    <w:p>
+      <w:pPr>
+        <w:shd w:val="clear" w:color="auto" w:fill="000000" w:themeFill="text1"/>
+        <w:spacing w:after="120" w:line="240" w:lineRule="auto"/>
+        <w:rPr>
+          <w:sz w:val="8"/>
+          <w:szCs w:val="8"/>
+        </w:rPr>
+      </w:pPr>
+      <w:r>
+        <w:rPr>
+          <w:sz w:val="8"/>
+          <w:szCs w:val="8"/>
+        </w:rPr>
+        <w:t>HashSet,contains,1000000,20</w:t>
+      </w:r>
+    </w:p>
+    <w:p>
+      <w:pPr>
+        <w:shd w:val="clear" w:color="auto" w:fill="000000" w:themeFill="text1"/>
+        <w:spacing w:after="120" w:line="240" w:lineRule="auto"/>
+        <w:rPr>
+          <w:sz w:val="8"/>
+          <w:szCs w:val="8"/>
+        </w:rPr>
+      </w:pPr>
+      <w:r>
+        <w:rPr>
+          <w:sz w:val="8"/>
+          <w:szCs w:val="8"/>
+        </w:rPr>
+        <w:t>TreeSet,contains,1000,88</w:t>
+      </w:r>
+    </w:p>
+    <w:p>
+      <w:pPr>
+        <w:shd w:val="clear" w:color="auto" w:fill="000000" w:themeFill="text1"/>
+        <w:spacing w:after="120" w:line="240" w:lineRule="auto"/>
+        <w:rPr>
+          <w:sz w:val="8"/>
+          <w:szCs w:val="8"/>
+        </w:rPr>
+      </w:pPr>
+      <w:r>
+        <w:rPr>
+          <w:sz w:val="8"/>
+          <w:szCs w:val="8"/>
+        </w:rPr>
+        <w:t>TreeSet,contains,5000,84</w:t>
+      </w:r>
+    </w:p>
+    <w:p>
+      <w:pPr>
+        <w:shd w:val="clear" w:color="auto" w:fill="000000" w:themeFill="text1"/>
+        <w:spacing w:after="120" w:line="240" w:lineRule="auto"/>
+        <w:rPr>
+          <w:sz w:val="8"/>
+          <w:szCs w:val="8"/>
+        </w:rPr>
+      </w:pPr>
+      <w:r>
+        <w:rPr>
+          <w:sz w:val="8"/>
+          <w:szCs w:val="8"/>
+        </w:rPr>
+        <w:t>TreeSet,contains,10000,86</w:t>
+      </w:r>
+    </w:p>
+    <w:p>
+      <w:pPr>
+        <w:shd w:val="clear" w:color="auto" w:fill="000000" w:themeFill="text1"/>
+        <w:spacing w:after="120" w:line="240" w:lineRule="auto"/>
+        <w:rPr>
+          <w:sz w:val="8"/>
+          <w:szCs w:val="8"/>
+        </w:rPr>
+      </w:pPr>
+      <w:r>
+        <w:rPr>
+          <w:sz w:val="8"/>
+          <w:szCs w:val="8"/>
+        </w:rPr>
+        <w:t>TreeSet,contains,50000,66</w:t>
+      </w:r>
+    </w:p>
+    <w:p>
+      <w:pPr>
+        <w:shd w:val="clear" w:color="auto" w:fill="000000" w:themeFill="text1"/>
+        <w:spacing w:after="120" w:line="240" w:lineRule="auto"/>
+        <w:rPr>
+          <w:sz w:val="8"/>
+          <w:szCs w:val="8"/>
+        </w:rPr>
+      </w:pPr>
+      <w:r>
+        <w:rPr>
+          <w:sz w:val="8"/>
+          <w:szCs w:val="8"/>
+        </w:rPr>
+        <w:t>TreeSet,contains,100000,69</w:t>
+      </w:r>
+    </w:p>
+    <w:p>
+      <w:pPr>
+        <w:shd w:val="clear" w:color="auto" w:fill="000000" w:themeFill="text1"/>
+        <w:spacing w:after="120" w:line="240" w:lineRule="auto"/>
+        <w:rPr>
+          <w:sz w:val="8"/>
+          <w:szCs w:val="8"/>
+        </w:rPr>
+      </w:pPr>
+      <w:r>
+        <w:rPr>
+          <w:sz w:val="8"/>
+          <w:szCs w:val="8"/>
+        </w:rPr>
+        <w:t>TreeSet,contains,500000,71</w:t>
+      </w:r>
+    </w:p>
+    <w:p>
+      <w:pPr>
+        <w:shd w:val="clear" w:color="auto" w:fill="000000" w:themeFill="text1"/>
+        <w:spacing w:after="120" w:line="240" w:lineRule="auto"/>
+        <w:rPr>
+          <w:sz w:val="8"/>
+          <w:szCs w:val="8"/>
+        </w:rPr>
+      </w:pPr>
+      <w:r>
+        <w:rPr>
+          <w:sz w:val="8"/>
+          <w:szCs w:val="8"/>
+        </w:rPr>
+        <w:t>TreeSet,contains,1000000,68</w:t>
+      </w:r>
+    </w:p>
+    <w:p>
+      <w:pPr>
+        <w:shd w:val="clear" w:color="auto" w:fill="000000" w:themeFill="text1"/>
+        <w:spacing w:after="120" w:line="240" w:lineRule="auto"/>
+        <w:rPr>
+          <w:sz w:val="8"/>
+          <w:szCs w:val="8"/>
+        </w:rPr>
+      </w:pPr>
+      <w:r>
+        <w:rPr>
+          <w:sz w:val="8"/>
+          <w:szCs w:val="8"/>
+        </w:rPr>
+        <w:t>HashMap,get,1000,37</w:t>
+      </w:r>
+    </w:p>
+    <w:p>
+      <w:pPr>
+        <w:shd w:val="clear" w:color="auto" w:fill="000000" w:themeFill="text1"/>
+        <w:spacing w:after="120" w:line="240" w:lineRule="auto"/>
+        <w:rPr>
+          <w:sz w:val="8"/>
+          <w:szCs w:val="8"/>
+        </w:rPr>
+      </w:pPr>
+      <w:r>
+        <w:rPr>
+          <w:sz w:val="8"/>
+          <w:szCs w:val="8"/>
+        </w:rPr>
+        <w:t>HashMap,get,5000,37</w:t>
+      </w:r>
+    </w:p>
+    <w:p>
+      <w:pPr>
+        <w:shd w:val="clear" w:color="auto" w:fill="000000" w:themeFill="text1"/>
+        <w:spacing w:after="120" w:line="240" w:lineRule="auto"/>
+        <w:rPr>
+          <w:sz w:val="8"/>
+          <w:szCs w:val="8"/>
+        </w:rPr>
+      </w:pPr>
+      <w:r>
+        <w:rPr>
+          <w:sz w:val="8"/>
+          <w:szCs w:val="8"/>
+        </w:rPr>
+        <w:t>HashMap,get,10000,45</w:t>
+      </w:r>
+    </w:p>
+    <w:p>
+      <w:pPr>
+        <w:shd w:val="clear" w:color="auto" w:fill="000000" w:themeFill="text1"/>
+        <w:spacing w:after="120" w:line="240" w:lineRule="auto"/>
+        <w:rPr>
+          <w:sz w:val="8"/>
+          <w:szCs w:val="8"/>
+        </w:rPr>
+      </w:pPr>
+      <w:r>
+        <w:rPr>
+          <w:sz w:val="8"/>
+          <w:szCs w:val="8"/>
+        </w:rPr>
+        <w:t>HashMap,get,50000,27</w:t>
+      </w:r>
+    </w:p>
+    <w:p>
+      <w:pPr>
+        <w:shd w:val="clear" w:color="auto" w:fill="000000" w:themeFill="text1"/>
+        <w:spacing w:after="120" w:line="240" w:lineRule="auto"/>
+        <w:rPr>
+          <w:sz w:val="8"/>
+          <w:szCs w:val="8"/>
+        </w:rPr>
+      </w:pPr>
+      <w:r>
+        <w:rPr>
+          <w:sz w:val="8"/>
+          <w:szCs w:val="8"/>
+        </w:rPr>
+        <w:t>HashMap,get,100000,29</w:t>
+      </w:r>
+    </w:p>
+    <w:p>
+      <w:pPr>
+        <w:shd w:val="clear" w:color="auto" w:fill="000000" w:themeFill="text1"/>
+        <w:spacing w:after="120" w:line="240" w:lineRule="auto"/>
+        <w:rPr>
+          <w:sz w:val="8"/>
+          <w:szCs w:val="8"/>
+        </w:rPr>
+      </w:pPr>
+      <w:r>
+        <w:rPr>
+          <w:sz w:val="8"/>
+          <w:szCs w:val="8"/>
+        </w:rPr>
+        <w:t>HashMap,get,500000,32</w:t>
+      </w:r>
+    </w:p>
+    <w:p>
+      <w:pPr>
+        <w:shd w:val="clear" w:color="auto" w:fill="000000" w:themeFill="text1"/>
+        <w:spacing w:after="120" w:line="240" w:lineRule="auto"/>
+        <w:rPr>
+          <w:sz w:val="8"/>
+          <w:szCs w:val="8"/>
+        </w:rPr>
+      </w:pPr>
+      <w:r>
+        <w:rPr>
+          <w:sz w:val="8"/>
+          <w:szCs w:val="8"/>
+        </w:rPr>
+        <w:t>HashMap,get,1000000,19</w:t>
+      </w:r>
+    </w:p>
+    <w:p>
+      <w:pPr>
+        <w:shd w:val="clear" w:color="auto" w:fill="000000" w:themeFill="text1"/>
+        <w:spacing w:after="120" w:line="240" w:lineRule="auto"/>
+        <w:rPr>
+          <w:sz w:val="8"/>
+          <w:szCs w:val="8"/>
+        </w:rPr>
+      </w:pPr>
+      <w:r>
+        <w:rPr>
+          <w:sz w:val="8"/>
+          <w:szCs w:val="8"/>
+        </w:rPr>
+        <w:t>TreeMap,get,1000,67</w:t>
+      </w:r>
+    </w:p>
+    <w:p>
+      <w:pPr>
+        <w:shd w:val="clear" w:color="auto" w:fill="000000" w:themeFill="text1"/>
+        <w:spacing w:after="120" w:line="240" w:lineRule="auto"/>
+        <w:rPr>
+          <w:sz w:val="8"/>
+          <w:szCs w:val="8"/>
+        </w:rPr>
+      </w:pPr>
+      <w:r>
+        <w:rPr>
+          <w:sz w:val="8"/>
+          <w:szCs w:val="8"/>
+        </w:rPr>
+        <w:t>TreeMap,get,5000,76</w:t>
+      </w:r>
+    </w:p>
+    <w:p>
+      <w:pPr>
+        <w:shd w:val="clear" w:color="auto" w:fill="000000" w:themeFill="text1"/>
+        <w:spacing w:after="120" w:line="240" w:lineRule="auto"/>
+        <w:rPr>
+          <w:sz w:val="8"/>
+          <w:szCs w:val="8"/>
+        </w:rPr>
+      </w:pPr>
+      <w:r>
+        <w:rPr>
+          <w:sz w:val="8"/>
+          <w:szCs w:val="8"/>
+        </w:rPr>
+        <w:t>TreeMap,get,10000,79</w:t>
+      </w:r>
+    </w:p>
+    <w:p>
+      <w:pPr>
+        <w:shd w:val="clear" w:color="auto" w:fill="000000" w:themeFill="text1"/>
+        <w:spacing w:after="120" w:line="240" w:lineRule="auto"/>
+        <w:rPr>
+          <w:sz w:val="8"/>
+          <w:szCs w:val="8"/>
+        </w:rPr>
+      </w:pPr>
+      <w:r>
+        <w:rPr>
+          <w:sz w:val="8"/>
+          <w:szCs w:val="8"/>
+        </w:rPr>
+        <w:t>TreeMap,get,50000,63</w:t>
+      </w:r>
+    </w:p>
+    <w:p>
+      <w:pPr>
+        <w:shd w:val="clear" w:color="auto" w:fill="000000" w:themeFill="text1"/>
+        <w:spacing w:after="120" w:line="240" w:lineRule="auto"/>
+        <w:rPr>
+          <w:sz w:val="8"/>
+          <w:szCs w:val="8"/>
+        </w:rPr>
+      </w:pPr>
+      <w:r>
+        <w:rPr>
+          <w:sz w:val="8"/>
+          <w:szCs w:val="8"/>
+        </w:rPr>
+        <w:t>TreeMap,get,100000,71</w:t>
+      </w:r>
+    </w:p>
+    <w:p>
+      <w:pPr>
+        <w:shd w:val="clear" w:color="auto" w:fill="000000" w:themeFill="text1"/>
+        <w:spacing w:after="120" w:line="240" w:lineRule="auto"/>
+        <w:rPr>
+          <w:sz w:val="8"/>
+          <w:szCs w:val="8"/>
+        </w:rPr>
+      </w:pPr>
+      <w:r>
+        <w:rPr>
+          <w:sz w:val="8"/>
+          <w:szCs w:val="8"/>
+        </w:rPr>
+        <w:t>TreeMap,get,500000,73</w:t>
+      </w:r>
+    </w:p>
+    <w:p>
+      <w:pPr>
+        <w:shd w:val="clear" w:color="auto" w:fill="000000" w:themeFill="text1"/>
+        <w:spacing w:after="120" w:line="240" w:lineRule="auto"/>
+        <w:rPr>
+          <w:sz w:val="8"/>
+          <w:szCs w:val="8"/>
+        </w:rPr>
+      </w:pPr>
+      <w:r>
+        <w:rPr>
+          <w:sz w:val="8"/>
+          <w:szCs w:val="8"/>
+        </w:rPr>
+        <w:t>TreeMap,get,1000000,67</w:t>
+      </w:r>
+    </w:p>
+    <w:p>
+      <w:pPr>
+        <w:shd w:val="clear" w:color="auto" w:fill="000000" w:themeFill="text1"/>
+        <w:spacing w:after="120" w:line="240" w:lineRule="auto"/>
+        <w:rPr>
+          <w:sz w:val="8"/>
+          <w:szCs w:val="8"/>
+        </w:rPr>
+      </w:pPr>
+      <w:r>
+        <w:rPr>
+          <w:sz w:val="8"/>
+          <w:szCs w:val="8"/>
+        </w:rPr>
+        <w:t>PriorityQueue,offer,1000,4</w:t>
+      </w:r>
+    </w:p>
+    <w:p>
+      <w:pPr>
+        <w:shd w:val="clear" w:color="auto" w:fill="000000" w:themeFill="text1"/>
+        <w:spacing w:after="120" w:line="240" w:lineRule="auto"/>
+        <w:rPr>
+          <w:sz w:val="8"/>
+          <w:szCs w:val="8"/>
+        </w:rPr>
+      </w:pPr>
+      <w:r>
+        <w:rPr>
+          <w:sz w:val="8"/>
+          <w:szCs w:val="8"/>
+        </w:rPr>
+        <w:t>PriorityQueue,peek,1000,27</w:t>
+      </w:r>
+    </w:p>
+    <w:p>
+      <w:pPr>
+        <w:shd w:val="clear" w:color="auto" w:fill="000000" w:themeFill="text1"/>
+        <w:spacing w:after="120" w:line="240" w:lineRule="auto"/>
+        <w:rPr>
+          <w:sz w:val="8"/>
+          <w:szCs w:val="8"/>
+        </w:rPr>
+      </w:pPr>
+      <w:r>
+        <w:rPr>
+          <w:sz w:val="8"/>
+          <w:szCs w:val="8"/>
+        </w:rPr>
+        <w:t>PriorityQueue,offer,5000,4</w:t>
+      </w:r>
+    </w:p>
+    <w:p>
+      <w:pPr>
+        <w:shd w:val="clear" w:color="auto" w:fill="000000" w:themeFill="text1"/>
+        <w:spacing w:after="120" w:line="240" w:lineRule="auto"/>
+        <w:rPr>
+          <w:sz w:val="8"/>
+          <w:szCs w:val="8"/>
+        </w:rPr>
+      </w:pPr>
+      <w:r>
+        <w:rPr>
+          <w:sz w:val="8"/>
+          <w:szCs w:val="8"/>
+        </w:rPr>
+        <w:t>PriorityQueue,peek,5000,27</w:t>
+      </w:r>
+    </w:p>
+    <w:p>
+      <w:pPr>
+        <w:shd w:val="clear" w:color="auto" w:fill="000000" w:themeFill="text1"/>
+        <w:spacing w:after="120" w:line="240" w:lineRule="auto"/>
+        <w:rPr>
+          <w:sz w:val="8"/>
+          <w:szCs w:val="8"/>
+        </w:rPr>
+      </w:pPr>
+      <w:r>
+        <w:rPr>
+          <w:sz w:val="8"/>
+          <w:szCs w:val="8"/>
+        </w:rPr>
+        <w:t>PriorityQueue,offer,10000,3</w:t>
+      </w:r>
+    </w:p>
+    <w:p>
+      <w:pPr>
+        <w:shd w:val="clear" w:color="auto" w:fill="000000" w:themeFill="text1"/>
+        <w:spacing w:after="120" w:line="240" w:lineRule="auto"/>
+        <w:rPr>
+          <w:sz w:val="8"/>
+          <w:szCs w:val="8"/>
+        </w:rPr>
+      </w:pPr>
+      <w:r>
+        <w:rPr>
+          <w:sz w:val="8"/>
+          <w:szCs w:val="8"/>
+        </w:rPr>
+        <w:t>PriorityQueue,peek,10000,27</w:t>
+      </w:r>
+    </w:p>
+    <w:p>
+      <w:pPr>
+        <w:shd w:val="clear" w:color="auto" w:fill="000000" w:themeFill="text1"/>
+        <w:spacing w:after="120" w:line="240" w:lineRule="auto"/>
+        <w:rPr>
+          <w:sz w:val="8"/>
+          <w:szCs w:val="8"/>
+        </w:rPr>
+      </w:pPr>
+      <w:r>
+        <w:rPr>
+          <w:sz w:val="8"/>
+          <w:szCs w:val="8"/>
+        </w:rPr>
+        <w:t>PriorityQueue,offer,50000,3</w:t>
+      </w:r>
+    </w:p>
+    <w:p>
+      <w:pPr>
+        <w:shd w:val="clear" w:color="auto" w:fill="000000" w:themeFill="text1"/>
+        <w:spacing w:after="120" w:line="240" w:lineRule="auto"/>
+        <w:rPr>
+          <w:sz w:val="8"/>
+          <w:szCs w:val="8"/>
+        </w:rPr>
+      </w:pPr>
+      <w:r>
+        <w:rPr>
+          <w:sz w:val="8"/>
+          <w:szCs w:val="8"/>
+        </w:rPr>
+        <w:t>PriorityQueue,peek,50000,17</w:t>
+      </w:r>
+    </w:p>
+    <w:p>
+      <w:pPr>
+        <w:shd w:val="clear" w:color="auto" w:fill="000000" w:themeFill="text1"/>
+        <w:spacing w:after="120" w:line="240" w:lineRule="auto"/>
+        <w:rPr>
+          <w:sz w:val="8"/>
+          <w:szCs w:val="8"/>
+        </w:rPr>
+      </w:pPr>
+      <w:r>
+        <w:rPr>
+          <w:sz w:val="8"/>
+          <w:szCs w:val="8"/>
+        </w:rPr>
+        <w:t>PriorityQueue,offer,100000,4</w:t>
+      </w:r>
+    </w:p>
+    <w:p>
+      <w:pPr>
+        <w:shd w:val="clear" w:color="auto" w:fill="000000" w:themeFill="text1"/>
+        <w:spacing w:after="120" w:line="240" w:lineRule="auto"/>
+        <w:rPr>
+          <w:sz w:val="8"/>
+          <w:szCs w:val="8"/>
+        </w:rPr>
+      </w:pPr>
+      <w:r>
+        <w:rPr>
+          <w:sz w:val="8"/>
+          <w:szCs w:val="8"/>
+        </w:rPr>
+        <w:t>PriorityQueue,peek,100000,17</w:t>
+      </w:r>
+    </w:p>
+    <w:p>
+      <w:pPr>
+        <w:shd w:val="clear" w:color="auto" w:fill="000000" w:themeFill="text1"/>
+        <w:spacing w:after="120" w:line="240" w:lineRule="auto"/>
+        <w:rPr>
+          <w:sz w:val="8"/>
+          <w:szCs w:val="8"/>
+        </w:rPr>
+      </w:pPr>
+      <w:r>
+        <w:rPr>
+          <w:sz w:val="8"/>
+          <w:szCs w:val="8"/>
+        </w:rPr>
+        <w:t>PriorityQueue,offer,500000,17</w:t>
+      </w:r>
+    </w:p>
+    <w:p>
+      <w:pPr>
+        <w:shd w:val="clear" w:color="auto" w:fill="000000" w:themeFill="text1"/>
+        <w:spacing w:after="120" w:line="240" w:lineRule="auto"/>
+        <w:rPr>
+          <w:sz w:val="8"/>
+          <w:szCs w:val="8"/>
+        </w:rPr>
+      </w:pPr>
+      <w:r>
+        <w:rPr>
+          <w:sz w:val="8"/>
+          <w:szCs w:val="8"/>
+        </w:rPr>
+        <w:t>PriorityQueue,peek,500000,19</w:t>
+      </w:r>
+    </w:p>
+    <w:p>
+      <w:pPr>
+        <w:shd w:val="clear" w:color="auto" w:fill="000000" w:themeFill="text1"/>
+        <w:spacing w:after="120" w:line="240" w:lineRule="auto"/>
+        <w:rPr>
+          <w:sz w:val="8"/>
+          <w:szCs w:val="8"/>
+        </w:rPr>
+      </w:pPr>
+      <w:r>
+        <w:rPr>
+          <w:sz w:val="8"/>
+          <w:szCs w:val="8"/>
+        </w:rPr>
+        <w:t>PriorityQueue,offer,1000000,29</w:t>
+      </w:r>
+    </w:p>
+    <w:p>
+      <w:pPr>
+        <w:shd w:val="clear" w:color="auto" w:fill="000000" w:themeFill="text1"/>
+        <w:spacing w:after="120" w:line="240" w:lineRule="auto"/>
+        <w:rPr>
+          <w:sz w:val="8"/>
+          <w:szCs w:val="8"/>
+        </w:rPr>
+      </w:pPr>
+      <w:r>
+        <w:rPr>
+          <w:sz w:val="8"/>
+          <w:szCs w:val="8"/>
+        </w:rPr>
+        <w:t>PriorityQueue,peek,1000000,27</w:t>
       </w:r>
     </w:p>
     <w:p>
@@ -1590,7 +2760,19 @@
         <w:spacing w:before="60" w:after="240"/>
       </w:pPr>
       <w:r>
+        <w:lastRenderedPageBreak/>
         <w:t xml:space="preserve"> </w:t>
+      </w:r>
+    </w:p>
+    <w:p>
+      <w:pPr>
+        <w:pBdr>
+          <w:bottom w:val="single" w:sz="4" w:space="8" w:color="C8C8C8"/>
+        </w:pBdr>
+        <w:spacing w:before="60" w:after="240"/>
+      </w:pPr>
+      <w:r>
+        <w:t xml:space="preserve">The observed curves aligned with my expectations. ArrayList.get() and add_end() remained constant, indicating O(1) performance, but add_end displayed a slight increase at 500K elements because of array resizing. LinkedList.get() showed a clear linear increase, rising from 689ns for 1K elements to 809,109ns for 1M elements, whereas addFirst() stayed consistent at 3-7ns. HashSet.contains() and HashMap.get() remained consistent at 20-64ns and 19-45ns, basically confirming the average O(1) performance. The key differences were observed in TreeSet.contains(), TreeMap.get(), and PriorityQueue.offer(), which remained unexpectedly stable rather than exhibiting logarithmic growth. This is due to the fact that with 1M elements, the tree’s height is roughly 20 comparisons, resulting in the constant overhead from method calls and object access dominating the measurement, rendering the logarithmic growth imperceptible at this scale. Finally, the array-backed heap of PriorityQueue enjoys outstanding cache locality. </w:t>
       </w:r>
     </w:p>
     <w:p>
@@ -1682,6 +2864,9 @@
       <w:r>
         <w:t xml:space="preserve"> </w:t>
       </w:r>
+      <w:r>
+        <w:t>TreeMap and TreeSet cost the most memory because each element requires a node with parent, left, and right pointers (three references) plus a color flag – about 40-48 bytes of overhead per entry just for tree navigation. LinkedList is also expensive since each element is wrapping  in a Node with next and prev references. HashMap is moderate because while each entry needs a Node with hash, key, value, and next reference, the bucket array is shared. ArrayList and ArrayDeque are most efficient, storing elements in a simple array with minimal overhead work. The extra bytes in tree structures pay for O(log n) search performance, in LinkedList they enable O(1) insertions anywhere, and hash structures trade some memory for O(1) average access.</w:t>
+      </w:r>
     </w:p>
     <w:p>
       <w:pPr>
@@ -1702,7 +2887,6 @@
         <w:spacing w:before="60" w:after="240"/>
       </w:pPr>
       <w:r>
-        <w:lastRenderedPageBreak/>
         <w:t xml:space="preserve"> </w:t>
       </w:r>
     </w:p>
@@ -1730,6 +2914,7 @@
     </w:p>
     <w:p>
       <w:r>
+        <w:lastRenderedPageBreak/>
         <w:t>4. Part C — The in-memory LOBSTER-like stream at scale</w:t>
       </w:r>
     </w:p>
@@ -1742,23 +2927,7 @@
           <w:b/>
           <w:bCs/>
         </w:rPr>
-        <w:t xml:space="preserve">What did you implement in the </w:t>
-      </w:r>
-      <w:proofErr w:type="gramStart"/>
-      <w:r>
-        <w:rPr>
-          <w:b/>
-          <w:bCs/>
-        </w:rPr>
-        <w:t>execute(</w:t>
-      </w:r>
-      <w:proofErr w:type="gramEnd"/>
-      <w:r>
-        <w:rPr>
-          <w:b/>
-          <w:bCs/>
-        </w:rPr>
-        <w:t>) method of LobsterStream.java? (a sentence or two)</w:t>
+        <w:t>What did you implement in the execute() method of LobsterStream.java? (a sentence or two)</w:t>
       </w:r>
     </w:p>
     <w:p>
@@ -1828,12 +2997,6 @@
         <w:gridCol w:w="6160"/>
       </w:tblGrid>
       <w:tr>
-        <w:tblPrEx>
-          <w:tblCellMar>
-            <w:top w:w="0" w:type="dxa"/>
-            <w:bottom w:w="0" w:type="dxa"/>
-          </w:tblCellMar>
-        </w:tblPrEx>
         <w:tc>
           <w:tcPr>
             <w:tcW w:w="3200" w:type="dxa"/>
@@ -1889,12 +3052,6 @@
         </w:tc>
       </w:tr>
       <w:tr>
-        <w:tblPrEx>
-          <w:tblCellMar>
-            <w:top w:w="0" w:type="dxa"/>
-            <w:bottom w:w="0" w:type="dxa"/>
-          </w:tblCellMar>
-        </w:tblPrEx>
         <w:tc>
           <w:tcPr>
             <w:tcW w:w="3200" w:type="dxa"/>
@@ -1950,12 +3107,6 @@
         </w:tc>
       </w:tr>
       <w:tr>
-        <w:tblPrEx>
-          <w:tblCellMar>
-            <w:top w:w="0" w:type="dxa"/>
-            <w:bottom w:w="0" w:type="dxa"/>
-          </w:tblCellMar>
-        </w:tblPrEx>
         <w:tc>
           <w:tcPr>
             <w:tcW w:w="3200" w:type="dxa"/>
@@ -2166,12 +3317,6 @@
         <w:gridCol w:w="4680"/>
       </w:tblGrid>
       <w:tr>
-        <w:tblPrEx>
-          <w:tblCellMar>
-            <w:top w:w="0" w:type="dxa"/>
-            <w:bottom w:w="0" w:type="dxa"/>
-          </w:tblCellMar>
-        </w:tblPrEx>
         <w:tc>
           <w:tcPr>
             <w:tcW w:w="4680" w:type="dxa"/>
@@ -2236,12 +3381,6 @@
         </w:tc>
       </w:tr>
       <w:tr>
-        <w:tblPrEx>
-          <w:tblCellMar>
-            <w:top w:w="0" w:type="dxa"/>
-            <w:bottom w:w="0" w:type="dxa"/>
-          </w:tblCellMar>
-        </w:tblPrEx>
         <w:tc>
           <w:tcPr>
             <w:tcW w:w="4680" w:type="dxa"/>
@@ -2261,7 +3400,6 @@
           </w:tcPr>
           <w:p>
             <w:r>
-              <w:lastRenderedPageBreak/>
               <w:t xml:space="preserve"> </w:t>
             </w:r>
           </w:p>
@@ -2291,12 +3429,6 @@
         </w:tc>
       </w:tr>
       <w:tr>
-        <w:tblPrEx>
-          <w:tblCellMar>
-            <w:top w:w="0" w:type="dxa"/>
-            <w:bottom w:w="0" w:type="dxa"/>
-          </w:tblCellMar>
-        </w:tblPrEx>
         <w:tc>
           <w:tcPr>
             <w:tcW w:w="4680" w:type="dxa"/>
@@ -2345,12 +3477,6 @@
         </w:tc>
       </w:tr>
       <w:tr>
-        <w:tblPrEx>
-          <w:tblCellMar>
-            <w:top w:w="0" w:type="dxa"/>
-            <w:bottom w:w="0" w:type="dxa"/>
-          </w:tblCellMar>
-        </w:tblPrEx>
         <w:tc>
           <w:tcPr>
             <w:tcW w:w="4680" w:type="dxa"/>
@@ -2370,6 +3496,7 @@
           </w:tcPr>
           <w:p>
             <w:r>
+              <w:lastRenderedPageBreak/>
               <w:t xml:space="preserve"> </w:t>
             </w:r>
           </w:p>
@@ -2633,7 +3760,6 @@
           <w:b/>
           <w:bCs/>
         </w:rPr>
-        <w:lastRenderedPageBreak/>
         <w:t>Part C (resource monitor</w:t>
       </w:r>
       <w:r>
@@ -2767,39 +3893,7 @@
           <w:b/>
           <w:bCs/>
         </w:rPr>
-        <w:t xml:space="preserve">Q1.  </w:t>
-      </w:r>
-      <w:proofErr w:type="spellStart"/>
-      <w:r>
-        <w:rPr>
-          <w:b/>
-          <w:bCs/>
-        </w:rPr>
-        <w:t>ArrayList</w:t>
-      </w:r>
-      <w:proofErr w:type="spellEnd"/>
-      <w:r>
-        <w:rPr>
-          <w:b/>
-          <w:bCs/>
-        </w:rPr>
-        <w:t xml:space="preserve"> and LinkedList are both Lists, yet your get(</w:t>
-      </w:r>
-      <w:proofErr w:type="spellStart"/>
-      <w:r>
-        <w:rPr>
-          <w:b/>
-          <w:bCs/>
-        </w:rPr>
-        <w:t>i</w:t>
-      </w:r>
-      <w:proofErr w:type="spellEnd"/>
-      <w:r>
-        <w:rPr>
-          <w:b/>
-          <w:bCs/>
-        </w:rPr>
-        <w:t>) curves differ. Describe both shapes, name each Big-O, and explain the cause.</w:t>
+        <w:t>Q1.  ArrayList and LinkedList are both Lists, yet your get(i) curves differ. Describe both shapes, name each Big-O, and explain the cause.</w:t>
       </w:r>
     </w:p>
     <w:p>
@@ -2855,39 +3949,7 @@
           <w:b/>
           <w:bCs/>
         </w:rPr>
-        <w:t xml:space="preserve">Q2.  From your results, which of </w:t>
-      </w:r>
-      <w:proofErr w:type="spellStart"/>
-      <w:r>
-        <w:rPr>
-          <w:b/>
-          <w:bCs/>
-        </w:rPr>
-        <w:t>HashMap.get</w:t>
-      </w:r>
-      <w:proofErr w:type="spellEnd"/>
-      <w:r>
-        <w:rPr>
-          <w:b/>
-          <w:bCs/>
-        </w:rPr>
-        <w:t xml:space="preserve"> and </w:t>
-      </w:r>
-      <w:proofErr w:type="spellStart"/>
-      <w:r>
-        <w:rPr>
-          <w:b/>
-          <w:bCs/>
-        </w:rPr>
-        <w:t>TreeMap.get</w:t>
-      </w:r>
-      <w:proofErr w:type="spellEnd"/>
-      <w:r>
-        <w:rPr>
-          <w:b/>
-          <w:bCs/>
-        </w:rPr>
-        <w:t xml:space="preserve"> stays flat and which rises with n? Explain what each does on a lookup.</w:t>
+        <w:t>Q2.  From your results, which of HashMap.get and TreeMap.get stays flat and which rises with n? Explain what each does on a lookup.</w:t>
       </w:r>
     </w:p>
     <w:p>
@@ -2943,23 +4005,7 @@
           <w:b/>
           <w:bCs/>
         </w:rPr>
-        <w:t xml:space="preserve">Q3.  Pick two structures with the same O(n) space but very different bytes per </w:t>
-      </w:r>
-      <w:proofErr w:type="gramStart"/>
-      <w:r>
-        <w:rPr>
-          <w:b/>
-          <w:bCs/>
-        </w:rPr>
-        <w:t>element, and</w:t>
-      </w:r>
-      <w:proofErr w:type="gramEnd"/>
-      <w:r>
-        <w:rPr>
-          <w:b/>
-          <w:bCs/>
-        </w:rPr>
-        <w:t xml:space="preserve"> explain where the extra bytes go.</w:t>
+        <w:t>Q3.  Pick two structures with the same O(n) space but very different bytes per element, and explain where the extra bytes go.</w:t>
       </w:r>
     </w:p>
     <w:p>
@@ -3094,12 +4140,6 @@
         <w:gridCol w:w="1360"/>
       </w:tblGrid>
       <w:tr>
-        <w:tblPrEx>
-          <w:tblCellMar>
-            <w:top w:w="0" w:type="dxa"/>
-            <w:bottom w:w="0" w:type="dxa"/>
-          </w:tblCellMar>
-        </w:tblPrEx>
         <w:trPr>
           <w:tblHeader/>
         </w:trPr>
@@ -3188,12 +4228,6 @@
         </w:tc>
       </w:tr>
       <w:tr>
-        <w:tblPrEx>
-          <w:tblCellMar>
-            <w:top w:w="0" w:type="dxa"/>
-            <w:bottom w:w="0" w:type="dxa"/>
-          </w:tblCellMar>
-        </w:tblPrEx>
         <w:tc>
           <w:tcPr>
             <w:tcW w:w="8000" w:type="dxa"/>
@@ -3246,12 +4280,6 @@
         </w:tc>
       </w:tr>
       <w:tr>
-        <w:tblPrEx>
-          <w:tblCellMar>
-            <w:top w:w="0" w:type="dxa"/>
-            <w:bottom w:w="0" w:type="dxa"/>
-          </w:tblCellMar>
-        </w:tblPrEx>
         <w:tc>
           <w:tcPr>
             <w:tcW w:w="8000" w:type="dxa"/>
@@ -3304,12 +4332,6 @@
         </w:tc>
       </w:tr>
       <w:tr>
-        <w:tblPrEx>
-          <w:tblCellMar>
-            <w:top w:w="0" w:type="dxa"/>
-            <w:bottom w:w="0" w:type="dxa"/>
-          </w:tblCellMar>
-        </w:tblPrEx>
         <w:tc>
           <w:tcPr>
             <w:tcW w:w="8000" w:type="dxa"/>
@@ -3362,12 +4384,6 @@
         </w:tc>
       </w:tr>
       <w:tr>
-        <w:tblPrEx>
-          <w:tblCellMar>
-            <w:top w:w="0" w:type="dxa"/>
-            <w:bottom w:w="0" w:type="dxa"/>
-          </w:tblCellMar>
-        </w:tblPrEx>
         <w:tc>
           <w:tcPr>
             <w:tcW w:w="8000" w:type="dxa"/>
@@ -3420,12 +4436,6 @@
         </w:tc>
       </w:tr>
       <w:tr>
-        <w:tblPrEx>
-          <w:tblCellMar>
-            <w:top w:w="0" w:type="dxa"/>
-            <w:bottom w:w="0" w:type="dxa"/>
-          </w:tblCellMar>
-        </w:tblPrEx>
         <w:tc>
           <w:tcPr>
             <w:tcW w:w="8000" w:type="dxa"/>
@@ -3478,12 +4488,6 @@
         </w:tc>
       </w:tr>
       <w:tr>
-        <w:tblPrEx>
-          <w:tblCellMar>
-            <w:top w:w="0" w:type="dxa"/>
-            <w:bottom w:w="0" w:type="dxa"/>
-          </w:tblCellMar>
-        </w:tblPrEx>
         <w:tc>
           <w:tcPr>
             <w:tcW w:w="8000" w:type="dxa"/>
@@ -3584,12 +4588,6 @@
         <w:gridCol w:w="4680"/>
       </w:tblGrid>
       <w:tr>
-        <w:tblPrEx>
-          <w:tblCellMar>
-            <w:top w:w="0" w:type="dxa"/>
-            <w:bottom w:w="0" w:type="dxa"/>
-          </w:tblCellMar>
-        </w:tblPrEx>
         <w:tc>
           <w:tcPr>
             <w:tcW w:w="4680" w:type="dxa"/>
@@ -3652,12 +4650,6 @@
         </w:tc>
       </w:tr>
       <w:tr>
-        <w:tblPrEx>
-          <w:tblCellMar>
-            <w:top w:w="0" w:type="dxa"/>
-            <w:bottom w:w="0" w:type="dxa"/>
-          </w:tblCellMar>
-        </w:tblPrEx>
         <w:tc>
           <w:tcPr>
             <w:tcW w:w="4680" w:type="dxa"/>
@@ -4611,7 +5603,6 @@
   <w:style w:type="character" w:default="1" w:styleId="DefaultParagraphFont">
     <w:name w:val="Default Paragraph Font"/>
     <w:uiPriority w:val="1"/>
-    <w:semiHidden/>
     <w:unhideWhenUsed/>
   </w:style>
   <w:style w:type="table" w:default="1" w:styleId="TableNormal">

</xml_diff>